<commit_message>
Kim12-1-2-Metallerin-Aktifligi: gorsel alanlarina Shutter onizlemeleri yerlestirildi (2.3 bicimi)
</commit_message>
<xml_diff>
--- a/Kim12-1-2-Metallerin-Aktifligi.docx
+++ b/Kim12-1-2-Metallerin-Aktifligi.docx
@@ -55,99 +55,73 @@
         <w:t xml:space="preserve">Bu sorunun cevabını bir etkinlik yaparak keşfediniz. Analiz ve Keşif Atölyesi 1.2.’de bilimsel sorgulama yapacaksınız: Metallerin aktiflik sıralamasına ilişkin araştırma soruları oluşturacak, seçtiğiniz soruya yönelik bir hipotez ve model geliştirecek, mikro ölçekli bir deney planlayıp gerçekleştirecek, elde ettiğiniz verileri hipotezinizle ilişkilendirerek yorumlayacak ve vardığınız sıralamayı tanecik modelleri ve yarı tepkime denklemleriyle açıklayarak bilimsel gösterimlerle karşılaştıracaksınız. Farklı fikirlere açık kalmanız ve araştırmacı bir tutum sergilemeniz çalışkanlık değerinizi destekleyecek; grubunuzla iş birliği içinde çalışırken iletişim becerilerinizi ve dostluk değerinizi geliştirecek, beklenmedik sonuçlar karşısında esnek davranarak yaratıcı çözümler üreteceksiniz.</w:t>
       </w:r>
     </w:p>
-    <w:tbl>
-      <w:tblPr>
-        <w:tblW w:w="9000" w:type="dxa"/>
+    <w:p>
+      <w:pPr>
         <w:jc w:val="center"/>
-        <w:tblBorders>
-          <w:top w:val="single" w:sz="8" w:space="0" w:color="7F7F7F"/>
-          <w:left w:val="single" w:sz="8" w:space="0" w:color="7F7F7F"/>
-          <w:bottom w:val="single" w:sz="8" w:space="0" w:color="7F7F7F"/>
-          <w:right w:val="single" w:sz="8" w:space="0" w:color="7F7F7F"/>
-        </w:tblBorders>
-      </w:tblPr>
-      <w:tblGrid>
-        <w:gridCol w:w="9000"/>
-      </w:tblGrid>
-      <w:tr>
-        <w:tc>
-          <w:tcPr>
-            <w:tcW w:w="9000" w:type="dxa"/>
-            <w:shd w:val="clear" w:color="auto" w:fill="EDEDED"/>
-          </w:tcPr>
-          <w:p>
-            <w:pPr>
-              <w:jc w:val="both"/>
-              <w:rPr>
-                <w:rFonts w:ascii="Times New Roman" w:hAnsi="Times New Roman" w:cs="Times New Roman"/>
-                <w:lang w:val="tr-TR"/>
-              </w:rPr>
-            </w:pPr>
-            <w:r>
-              <w:rPr>
-                <w:rFonts w:ascii="Times New Roman" w:hAnsi="Times New Roman" w:cs="Times New Roman"/>
-                <w:lang w:val="tr-TR"/>
-              </w:rPr>
-              <w:t xml:space="preserve">GÖRSEL ALANI (Shutterstock)</w:t>
-            </w:r>
-          </w:p>
-          <w:p>
-            <w:pPr>
-              <w:jc w:val="both"/>
-              <w:rPr>
-                <w:rFonts w:ascii="Times New Roman" w:hAnsi="Times New Roman" w:cs="Times New Roman"/>
-                <w:lang w:val="tr-TR"/>
-              </w:rPr>
-            </w:pPr>
-            <w:r>
-              <w:rPr>
-                <w:rFonts w:ascii="Times New Roman" w:hAnsi="Times New Roman" w:cs="Times New Roman"/>
-                <w:lang w:val="tr-TR"/>
-              </w:rPr>
-              <w:t xml:space="preserve">Tarif: Müze vitrininde sergilenen, Tunç Çağı’na ait parlak altın kap ve süs eşyaları (müze etiketleri ve logolar görünmesin).</w:t>
-            </w:r>
-          </w:p>
-          <w:p>
-            <w:pPr>
-              <w:jc w:val="both"/>
-              <w:rPr>
-                <w:rFonts w:ascii="Times New Roman" w:hAnsi="Times New Roman" w:cs="Times New Roman"/>
-                <w:lang w:val="tr-TR"/>
-              </w:rPr>
-            </w:pPr>
-            <w:r>
-              <w:rPr>
-                <w:rFonts w:ascii="Times New Roman" w:hAnsi="Times New Roman" w:cs="Times New Roman"/>
-                <w:lang w:val="tr-TR"/>
-              </w:rPr>
-              <w:t xml:space="preserve">Shutter ID: 2695029349 (fotoğraf) — Ancient gold bracelet (Alacahöyük eseri değil; temsilî)</w:t>
-            </w:r>
-          </w:p>
-        </w:tc>
-      </w:tr>
-    </w:tbl>
-    <w:p>
-      <w:pPr>
-        <w:jc w:val="both"/>
-        <w:rPr>
-          <w:rFonts w:ascii="Times New Roman" w:hAnsi="Times New Roman" w:cs="Times New Roman"/>
-          <w:lang w:val="tr-TR"/>
-        </w:rPr>
-      </w:pPr>
+      </w:pPr>
+      <w:r>
+        <w:drawing>
+          <wp:inline xmlns:a="http://schemas.openxmlformats.org/drawingml/2006/main" xmlns:pic="http://schemas.openxmlformats.org/drawingml/2006/picture">
+            <wp:extent cx="3439490" cy="2520000"/>
+            <wp:docPr id="900010" name="Picture 900010"/>
+            <wp:cNvGraphicFramePr>
+              <a:graphicFrameLocks noChangeAspect="1"/>
+            </wp:cNvGraphicFramePr>
+            <a:graphic>
+              <a:graphicData uri="http://schemas.openxmlformats.org/drawingml/2006/picture">
+                <pic:pic>
+                  <pic:nvPicPr>
+                    <pic:cNvPr id="0" name="2695029349_d.jpg"/>
+                    <pic:cNvPicPr/>
+                  </pic:nvPicPr>
+                  <pic:blipFill>
+                    <a:blip r:embed="rId11"/>
+                    <a:stretch>
+                      <a:fillRect/>
+                    </a:stretch>
+                  </pic:blipFill>
+                  <pic:spPr>
+                    <a:xfrm>
+                      <a:off x="0" y="0"/>
+                      <a:ext cx="3439490" cy="2520000"/>
+                    </a:xfrm>
+                    <a:prstGeom prst="rect"/>
+                  </pic:spPr>
+                </pic:pic>
+              </a:graphicData>
+            </a:graphic>
+          </wp:inline>
+        </w:drawing>
+      </w:r>
     </w:p>
     <w:p>
       <w:pPr>
         <w:jc w:val="center"/>
-        <w:rPr>
-          <w:rFonts w:ascii="Times New Roman" w:hAnsi="Times New Roman" w:cs="Times New Roman"/>
-          <w:lang w:val="tr-TR"/>
-        </w:rPr>
       </w:pPr>
       <w:r>
         <w:rPr>
           <w:rFonts w:ascii="Times New Roman" w:hAnsi="Times New Roman" w:cs="Times New Roman"/>
           <w:b/>
           <w:bCs/>
+          <w:highlight w:val="yellow"/>
+          <w:lang w:val="tr-TR"/>
+        </w:rPr>
+        <w:t xml:space="preserve">Shutter id: 2695029349</w:t>
+      </w:r>
+    </w:p>
+    <w:p>
+      <w:pPr>
+        <w:jc w:val="center"/>
+        <w:rPr>
+          <w:rFonts w:ascii="Times New Roman" w:hAnsi="Times New Roman" w:cs="Times New Roman"/>
+          <w:lang w:val="tr-TR"/>
+        </w:rPr>
+      </w:pPr>
+      <w:r>
+        <w:rPr>
+          <w:rFonts w:ascii="Times New Roman" w:hAnsi="Times New Roman" w:cs="Times New Roman"/>
+          <w:b/>
+          <w:bCs/>
           <w:lang w:val="tr-TR"/>
         </w:rPr>
         <w:t xml:space="preserve">Görsel A:</w:t>
@@ -160,85 +134,59 @@
         <w:t xml:space="preserve"> Alacahöyük altın eserleri</w:t>
       </w:r>
     </w:p>
-    <w:tbl>
-      <w:tblPr>
-        <w:tblW w:w="9000" w:type="dxa"/>
+    <w:p>
+      <w:pPr>
         <w:jc w:val="center"/>
-        <w:tblBorders>
-          <w:top w:val="single" w:sz="8" w:space="0" w:color="7F7F7F"/>
-          <w:left w:val="single" w:sz="8" w:space="0" w:color="7F7F7F"/>
-          <w:bottom w:val="single" w:sz="8" w:space="0" w:color="7F7F7F"/>
-          <w:right w:val="single" w:sz="8" w:space="0" w:color="7F7F7F"/>
-        </w:tblBorders>
-      </w:tblPr>
-      <w:tblGrid>
-        <w:gridCol w:w="9000"/>
-      </w:tblGrid>
-      <w:tr>
-        <w:tc>
-          <w:tcPr>
-            <w:tcW w:w="9000" w:type="dxa"/>
-            <w:shd w:val="clear" w:color="auto" w:fill="EDEDED"/>
-          </w:tcPr>
-          <w:p>
-            <w:pPr>
-              <w:jc w:val="both"/>
-              <w:rPr>
-                <w:rFonts w:ascii="Times New Roman" w:hAnsi="Times New Roman" w:cs="Times New Roman"/>
-                <w:lang w:val="tr-TR"/>
-              </w:rPr>
-            </w:pPr>
-            <w:r>
-              <w:rPr>
-                <w:rFonts w:ascii="Times New Roman" w:hAnsi="Times New Roman" w:cs="Times New Roman"/>
-                <w:lang w:val="tr-TR"/>
-              </w:rPr>
-              <w:t xml:space="preserve">GÖRSEL ALANI (Shutterstock)</w:t>
-            </w:r>
-          </w:p>
-          <w:p>
-            <w:pPr>
-              <w:jc w:val="both"/>
-              <w:rPr>
-                <w:rFonts w:ascii="Times New Roman" w:hAnsi="Times New Roman" w:cs="Times New Roman"/>
-                <w:lang w:val="tr-TR"/>
-              </w:rPr>
-            </w:pPr>
-            <w:r>
-              <w:rPr>
-                <w:rFonts w:ascii="Times New Roman" w:hAnsi="Times New Roman" w:cs="Times New Roman"/>
-                <w:lang w:val="tr-TR"/>
-              </w:rPr>
-              <w:t xml:space="preserve">Tarif: Yan yana duran yüzeyi paslanmış galvanizli demir boru parçası ile parlak bakır su boruları.</w:t>
-            </w:r>
-          </w:p>
-          <w:p>
-            <w:pPr>
-              <w:jc w:val="both"/>
-              <w:rPr>
-                <w:rFonts w:ascii="Times New Roman" w:hAnsi="Times New Roman" w:cs="Times New Roman"/>
-                <w:lang w:val="tr-TR"/>
-              </w:rPr>
-            </w:pPr>
-            <w:r>
-              <w:rPr>
-                <w:rFonts w:ascii="Times New Roman" w:hAnsi="Times New Roman" w:cs="Times New Roman"/>
-                <w:lang w:val="tr-TR"/>
-              </w:rPr>
-              <w:t xml:space="preserve">Shutter ID: 2001791231 (fotoğraf) — Galvanic corrosion between copper and iron pipes</w:t>
-            </w:r>
-          </w:p>
-        </w:tc>
-      </w:tr>
-    </w:tbl>
-    <w:p>
-      <w:pPr>
-        <w:jc w:val="both"/>
-        <w:rPr>
-          <w:rFonts w:ascii="Times New Roman" w:hAnsi="Times New Roman" w:cs="Times New Roman"/>
-          <w:lang w:val="tr-TR"/>
-        </w:rPr>
-      </w:pPr>
+      </w:pPr>
+      <w:r>
+        <w:drawing>
+          <wp:inline xmlns:a="http://schemas.openxmlformats.org/drawingml/2006/main" xmlns:pic="http://schemas.openxmlformats.org/drawingml/2006/picture">
+            <wp:extent cx="5040000" cy="1827840"/>
+            <wp:docPr id="900011" name="Picture 900011"/>
+            <wp:cNvGraphicFramePr>
+              <a:graphicFrameLocks noChangeAspect="1"/>
+            </wp:cNvGraphicFramePr>
+            <a:graphic>
+              <a:graphicData uri="http://schemas.openxmlformats.org/drawingml/2006/picture">
+                <pic:pic>
+                  <pic:nvPicPr>
+                    <pic:cNvPr id="0" name="2001791231_d.jpg"/>
+                    <pic:cNvPicPr/>
+                  </pic:nvPicPr>
+                  <pic:blipFill>
+                    <a:blip r:embed="rId12"/>
+                    <a:stretch>
+                      <a:fillRect/>
+                    </a:stretch>
+                  </pic:blipFill>
+                  <pic:spPr>
+                    <a:xfrm>
+                      <a:off x="0" y="0"/>
+                      <a:ext cx="5040000" cy="1827840"/>
+                    </a:xfrm>
+                    <a:prstGeom prst="rect"/>
+                  </pic:spPr>
+                </pic:pic>
+              </a:graphicData>
+            </a:graphic>
+          </wp:inline>
+        </w:drawing>
+      </w:r>
+    </w:p>
+    <w:p>
+      <w:pPr>
+        <w:jc w:val="center"/>
+      </w:pPr>
+      <w:r>
+        <w:rPr>
+          <w:rFonts w:ascii="Times New Roman" w:hAnsi="Times New Roman" w:cs="Times New Roman"/>
+          <w:b/>
+          <w:bCs/>
+          <w:highlight w:val="yellow"/>
+          <w:lang w:val="tr-TR"/>
+        </w:rPr>
+        <w:t xml:space="preserve">Shutter id: 2001791231</w:t>
+      </w:r>
     </w:p>
     <w:p>
       <w:pPr>
@@ -347,101 +295,59 @@
         <w:t xml:space="preserve">Sınıfınızda gruplara ayrılınız. Etkinlik kâğıdınızda bakır, çinko, demir ve kurşun metallerinden kesilmiş küçük parçalar ile bu metallerin tuzlarının sulu çözeltileri (bakır(II) nitrat, çinko nitrat, demir(II) sülfat ve kurşun(II) nitrat) verilmiştir. Bu malzemeleri kullanarak dört metalin aktiflik sıralamasını belirlemeye yönelik bir bilimsel sorgulama yapacaksınız.</w:t>
       </w:r>
     </w:p>
-    <w:tbl>
-      <w:tblPr>
-        <w:tblW w:w="9000" w:type="dxa"/>
+    <w:p>
+      <w:pPr>
         <w:jc w:val="center"/>
-        <w:tblBorders>
-          <w:top w:val="single" w:sz="8" w:space="0" w:color="7F7F7F"/>
-          <w:left w:val="single" w:sz="8" w:space="0" w:color="7F7F7F"/>
-          <w:bottom w:val="single" w:sz="8" w:space="0" w:color="7F7F7F"/>
-          <w:right w:val="single" w:sz="8" w:space="0" w:color="7F7F7F"/>
-        </w:tblBorders>
-      </w:tblPr>
-      <w:tblGrid>
-        <w:gridCol w:w="9000"/>
-      </w:tblGrid>
-      <w:tr>
-        <w:tc>
-          <w:tcPr>
-            <w:tcW w:w="9000" w:type="dxa"/>
-            <w:shd w:val="clear" w:color="auto" w:fill="EDEDED"/>
-          </w:tcPr>
-          <w:p>
-            <w:pPr>
-              <w:jc w:val="both"/>
-              <w:rPr>
-                <w:rFonts w:ascii="Times New Roman" w:hAnsi="Times New Roman" w:cs="Times New Roman"/>
-                <w:lang w:val="tr-TR"/>
-              </w:rPr>
-            </w:pPr>
-            <w:r>
-              <w:rPr>
-                <w:rFonts w:ascii="Times New Roman" w:hAnsi="Times New Roman" w:cs="Times New Roman"/>
-                <w:lang w:val="tr-TR"/>
-              </w:rPr>
-              <w:t xml:space="preserve">GÖRSEL ALANI</w:t>
-            </w:r>
-          </w:p>
-          <w:p>
-            <w:pPr>
-              <w:jc w:val="both"/>
-              <w:rPr>
-                <w:rFonts w:ascii="Times New Roman" w:hAnsi="Times New Roman" w:cs="Times New Roman"/>
-                <w:lang w:val="tr-TR"/>
-              </w:rPr>
-            </w:pPr>
-            <w:r>
-              <w:rPr>
-                <w:rFonts w:ascii="Times New Roman" w:hAnsi="Times New Roman" w:cs="Times New Roman"/>
-                <w:lang w:val="tr-TR"/>
-              </w:rPr>
-              <w:t xml:space="preserve">Tarif: Laboratuvar tezgâhında etiketli küçük şişelerde renkli ve renksiz metal tuzu çözeltileri (mavi bakır(II) nitrat, açık yeşil demir(II) sülfat, renksiz çinko nitrat ve kurşun(II) nitrat) ile önlerinde petri kaplarında bakır, çinko, demir ve kurşun parçaları.</w:t>
-            </w:r>
-          </w:p>
-          <w:p>
-            <w:pPr>
-              <w:jc w:val="both"/>
-              <w:rPr>
-                <w:rFonts w:ascii="Times New Roman" w:hAnsi="Times New Roman" w:cs="Times New Roman"/>
-                <w:lang w:val="tr-TR"/>
-              </w:rPr>
-            </w:pPr>
-            <w:r>
-              <w:rPr>
-                <w:rFonts w:ascii="Times New Roman" w:hAnsi="Times New Roman" w:cs="Times New Roman"/>
-                <w:lang w:val="tr-TR"/>
-              </w:rPr>
-              <w:t xml:space="preserve">Shutterstock arama: “metal pieces salt solutions laboratory reactivity”</w:t>
-            </w:r>
-          </w:p>
-          <w:p>
-            <w:pPr>
-              <w:jc w:val="both"/>
-              <w:rPr>
-                <w:rFonts w:ascii="Times New Roman" w:hAnsi="Times New Roman" w:cs="Times New Roman"/>
-                <w:lang w:val="tr-TR"/>
-              </w:rPr>
-            </w:pPr>
-            <w:r>
-              <w:rPr>
-                <w:rFonts w:ascii="Times New Roman" w:hAnsi="Times New Roman" w:cs="Times New Roman"/>
-                <w:lang w:val="tr-TR"/>
-              </w:rPr>
-              <w:t xml:space="preserve">Shutter ID: 1211630155 (bakır sülfat çözeltisinde çinko levha). Alternatif: 1214921941. Tarifteki dört metal ve dört çözeltiyi birlikte gösteren fotoğraf bulunamadı; düzenek fotoğrafı çekilebilir.</w:t>
-            </w:r>
-          </w:p>
-        </w:tc>
-      </w:tr>
-    </w:tbl>
-    <w:p>
-      <w:pPr>
-        <w:jc w:val="both"/>
-        <w:rPr>
-          <w:rFonts w:ascii="Times New Roman" w:hAnsi="Times New Roman" w:cs="Times New Roman"/>
-          <w:lang w:val="tr-TR"/>
-        </w:rPr>
-      </w:pPr>
+      </w:pPr>
+      <w:r>
+        <w:drawing>
+          <wp:inline xmlns:a="http://schemas.openxmlformats.org/drawingml/2006/main" xmlns:pic="http://schemas.openxmlformats.org/drawingml/2006/picture">
+            <wp:extent cx="4000000" cy="2520000"/>
+            <wp:docPr id="900012" name="Picture 900012"/>
+            <wp:cNvGraphicFramePr>
+              <a:graphicFrameLocks noChangeAspect="1"/>
+            </wp:cNvGraphicFramePr>
+            <a:graphic>
+              <a:graphicData uri="http://schemas.openxmlformats.org/drawingml/2006/picture">
+                <pic:pic>
+                  <pic:nvPicPr>
+                    <pic:cNvPr id="0" name="1211630155_d.jpg"/>
+                    <pic:cNvPicPr/>
+                  </pic:nvPicPr>
+                  <pic:blipFill>
+                    <a:blip r:embed="rId13"/>
+                    <a:stretch>
+                      <a:fillRect/>
+                    </a:stretch>
+                  </pic:blipFill>
+                  <pic:spPr>
+                    <a:xfrm>
+                      <a:off x="0" y="0"/>
+                      <a:ext cx="4000000" cy="2520000"/>
+                    </a:xfrm>
+                    <a:prstGeom prst="rect"/>
+                  </pic:spPr>
+                </pic:pic>
+              </a:graphicData>
+            </a:graphic>
+          </wp:inline>
+        </w:drawing>
+      </w:r>
+    </w:p>
+    <w:p>
+      <w:pPr>
+        <w:jc w:val="center"/>
+      </w:pPr>
+      <w:r>
+        <w:rPr>
+          <w:rFonts w:ascii="Times New Roman" w:hAnsi="Times New Roman" w:cs="Times New Roman"/>
+          <w:b/>
+          <w:bCs/>
+          <w:highlight w:val="yellow"/>
+          <w:lang w:val="tr-TR"/>
+        </w:rPr>
+        <w:t xml:space="preserve">Shutter id: 1211630155</w:t>
+      </w:r>
     </w:p>
     <w:p>
       <w:pPr>

</xml_diff>

<commit_message>
Ingilizce yazi iceren gorsellere (1.2 galvanik korozyon, 1.4 lityum pil, 2.3 karbon allotroplari) Turkce karsiliklar sari NOT olarak eklendi
</commit_message>
<xml_diff>
--- a/Kim12-1-2-Metallerin-Aktifligi.docx
+++ b/Kim12-1-2-Metallerin-Aktifligi.docx
@@ -186,6 +186,26 @@
           <w:lang w:val="tr-TR"/>
         </w:rPr>
         <w:t xml:space="preserve">Shutter id: 2001791231</w:t>
+      </w:r>
+    </w:p>
+    <w:p>
+      <w:r>
+        <w:rPr>
+          <w:rFonts w:ascii="Times New Roman" w:hAnsi="Times New Roman" w:cs="Times New Roman"/>
+          <w:b/>
+          <w:highlight w:val="yellow"/>
+          <w:lang w:val="tr-TR"/>
+        </w:rPr>
+        <w:t xml:space="preserve">NOT: </w:t>
+      </w:r>
+      <w:r>
+        <w:rPr>
+          <w:rFonts w:ascii="Times New Roman" w:hAnsi="Times New Roman" w:cs="Times New Roman"/>
+          <w:b w:val="0"/>
+          <w:highlight w:val="yellow"/>
+          <w:lang w:val="tr-TR"/>
+        </w:rPr>
+        <w:t>Görseldeki İngilizce yazılar Türkçeye çevrilecek: Copper Pipe, Cathode (−): Bakır boru, katot (−); Iron Pipe, Anode (+): Demir boru, anot (+); Iron Socket: Demir bağlantı parçası; Negative Ions: Negatif iyonlar; Positive Ions Flow: Pozitif iyon akışı; Electron Flow: Elektron akışı; Galvanic Corrosion: Galvanik korozyon. Not: Galvanik hücrede anot (−), katot (+) kutuptur; görseldeki işaretler ters verilmiştir, Türkçeleştirilirken düzeltilmelidir (bakır: katot, demir: anot).</w:t>
       </w:r>
     </w:p>
     <w:p>

</xml_diff>